<commit_message>
Team 6: ST - updated headings for class diagrams
</commit_message>
<xml_diff>
--- a/03_Team_Work/Team6/Milestone_4_Interfaces_and_Data_Structures/ST_M4_Team6_ClassDiagrams-ResumeServiceSubmissionAndStorage_v01.docx
+++ b/03_Team_Work/Team6/Milestone_4_Interfaces_and_Data_Structures/ST_M4_Team6_ClassDiagrams-ResumeServiceSubmissionAndStorage_v01.docx
@@ -15,6 +15,17 @@
           <w:lang w:val="en-US"/>
         </w:rPr>
       </w:pPr>
+      <w:r>
+        <w:rPr>
+          <w:rFonts w:ascii="Arial" w:hAnsi="Arial" w:cs="Arial"/>
+          <w:b/>
+          <w:bCs/>
+          <w:sz w:val="27"/>
+          <w:szCs w:val="27"/>
+          <w:lang w:val="en-US"/>
+        </w:rPr>
+        <w:t xml:space="preserve">1.7.3-CD </w:t>
+      </w:r>
       <w:proofErr w:type="spellStart"/>
       <w:r>
         <w:rPr>
@@ -43,6 +54,7 @@
     <w:p>
       <w:pPr>
         <w:keepNext/>
+        <w:jc w:val="center"/>
         <w:outlineLvl w:val="2"/>
         <w:rPr>
           <w:rFonts w:ascii="Arial" w:hAnsi="Arial" w:cs="Arial"/>
@@ -62,10 +74,10 @@
           <w:szCs w:val="27"/>
         </w:rPr>
         <w:drawing>
-          <wp:inline distT="0" distB="0" distL="0" distR="0" wp14:anchorId="48E1C8B1" wp14:editId="06498DDE">
-            <wp:extent cx="5943600" cy="1606550"/>
+          <wp:inline distT="0" distB="0" distL="0" distR="0" wp14:anchorId="15339CFF" wp14:editId="0CC805EF">
+            <wp:extent cx="5943600" cy="1208405"/>
             <wp:effectExtent l="0" t="0" r="0" b="0"/>
-            <wp:docPr id="1352687900" name="Picture 1"/>
+            <wp:docPr id="238037717" name="Picture 4"/>
             <wp:cNvGraphicFramePr>
               <a:graphicFrameLocks xmlns:a="http://schemas.openxmlformats.org/drawingml/2006/main" noChangeAspect="1"/>
             </wp:cNvGraphicFramePr>
@@ -73,11 +85,11 @@
               <a:graphicData uri="http://schemas.openxmlformats.org/drawingml/2006/picture">
                 <pic:pic xmlns:pic="http://schemas.openxmlformats.org/drawingml/2006/picture">
                   <pic:nvPicPr>
-                    <pic:cNvPr id="1352687900" name="Picture 1352687900"/>
+                    <pic:cNvPr id="238037717" name="Picture 238037717"/>
                     <pic:cNvPicPr/>
                   </pic:nvPicPr>
                   <pic:blipFill>
-                    <a:blip r:embed="rId4" cstate="print">
+                    <a:blip r:embed="rId4">
                       <a:extLst>
                         <a:ext uri="{28A0092B-C50C-407E-A947-70E740481C1C}">
                           <a14:useLocalDpi xmlns:a14="http://schemas.microsoft.com/office/drawing/2010/main" val="0"/>
@@ -91,7 +103,7 @@
                   <pic:spPr>
                     <a:xfrm>
                       <a:off x="0" y="0"/>
-                      <a:ext cx="5943600" cy="1606550"/>
+                      <a:ext cx="5943600" cy="1208405"/>
                     </a:xfrm>
                     <a:prstGeom prst="rect">
                       <a:avLst/>
@@ -117,8 +129,18 @@
           <w:lang w:val="en-US"/>
         </w:rPr>
       </w:pPr>
+      <w:r>
+        <w:rPr>
+          <w:rFonts w:ascii="Arial" w:hAnsi="Arial" w:cs="Arial"/>
+          <w:b/>
+          <w:bCs/>
+          <w:sz w:val="27"/>
+          <w:szCs w:val="27"/>
+          <w:lang w:val="en-US"/>
+        </w:rPr>
+        <w:t xml:space="preserve">1.7.3-CD </w:t>
+      </w:r>
       <w:proofErr w:type="spellStart"/>
-      <w:proofErr w:type="gramStart"/>
       <w:r>
         <w:rPr>
           <w:rFonts w:ascii="Arial" w:hAnsi="Arial" w:cs="Arial"/>
@@ -131,7 +153,6 @@
         <w:t>ResumeSubmission</w:t>
       </w:r>
       <w:proofErr w:type="spellEnd"/>
-      <w:proofErr w:type="gramEnd"/>
       <w:r>
         <w:rPr>
           <w:rFonts w:ascii="Arial" w:hAnsi="Arial" w:cs="Arial"/>
@@ -147,6 +168,7 @@
     <w:p>
       <w:pPr>
         <w:keepNext/>
+        <w:jc w:val="center"/>
         <w:outlineLvl w:val="2"/>
         <w:rPr>
           <w:rFonts w:ascii="Arial" w:hAnsi="Arial" w:cs="Arial"/>
@@ -168,10 +190,10 @@
           <w:lang w:val="en-US"/>
         </w:rPr>
         <w:drawing>
-          <wp:inline distT="0" distB="0" distL="0" distR="0" wp14:anchorId="6D0CED9D" wp14:editId="1CE7DE58">
-            <wp:extent cx="5943600" cy="2139950"/>
+          <wp:inline distT="0" distB="0" distL="0" distR="0" wp14:anchorId="48B1D258" wp14:editId="3FE55747">
+            <wp:extent cx="5943600" cy="1603375"/>
             <wp:effectExtent l="0" t="0" r="0" b="0"/>
-            <wp:docPr id="1937833453" name="Picture 2"/>
+            <wp:docPr id="1651884787" name="Picture 2"/>
             <wp:cNvGraphicFramePr>
               <a:graphicFrameLocks xmlns:a="http://schemas.openxmlformats.org/drawingml/2006/main" noChangeAspect="1"/>
             </wp:cNvGraphicFramePr>
@@ -179,11 +201,11 @@
               <a:graphicData uri="http://schemas.openxmlformats.org/drawingml/2006/picture">
                 <pic:pic xmlns:pic="http://schemas.openxmlformats.org/drawingml/2006/picture">
                   <pic:nvPicPr>
-                    <pic:cNvPr id="1937833453" name="Picture 1937833453"/>
+                    <pic:cNvPr id="1651884787" name="Picture 1651884787"/>
                     <pic:cNvPicPr/>
                   </pic:nvPicPr>
                   <pic:blipFill>
-                    <a:blip r:embed="rId5" cstate="print">
+                    <a:blip r:embed="rId5">
                       <a:extLst>
                         <a:ext uri="{28A0092B-C50C-407E-A947-70E740481C1C}">
                           <a14:useLocalDpi xmlns:a14="http://schemas.microsoft.com/office/drawing/2010/main" val="0"/>
@@ -197,7 +219,7 @@
                   <pic:spPr>
                     <a:xfrm>
                       <a:off x="0" y="0"/>
-                      <a:ext cx="5943600" cy="2139950"/>
+                      <a:ext cx="5943600" cy="1603375"/>
                     </a:xfrm>
                     <a:prstGeom prst="rect">
                       <a:avLst/>
@@ -223,6 +245,39 @@
           <w:lang w:val="en-US"/>
         </w:rPr>
       </w:pPr>
+      <w:r>
+        <w:rPr>
+          <w:rFonts w:ascii="Arial" w:hAnsi="Arial" w:cs="Arial"/>
+          <w:b/>
+          <w:bCs/>
+          <w:sz w:val="27"/>
+          <w:szCs w:val="27"/>
+          <w:lang w:val="en-US"/>
+        </w:rPr>
+        <w:t>1.7.5</w:t>
+      </w:r>
+      <w:r>
+        <w:rPr>
+          <w:rFonts w:ascii="Arial" w:hAnsi="Arial" w:cs="Arial"/>
+          <w:b/>
+          <w:bCs/>
+          <w:sz w:val="27"/>
+          <w:szCs w:val="27"/>
+          <w:lang w:val="en-US"/>
+        </w:rPr>
+        <w:t>-CD</w:t>
+      </w:r>
+      <w:r>
+        <w:rPr>
+          <w:rFonts w:ascii="Arial" w:hAnsi="Arial" w:cs="Arial"/>
+          <w:b/>
+          <w:bCs/>
+          <w:sz w:val="27"/>
+          <w:szCs w:val="27"/>
+          <w:lang w:val="en-US"/>
+        </w:rPr>
+        <w:t xml:space="preserve"> </w:t>
+      </w:r>
       <w:proofErr w:type="spellStart"/>
       <w:r>
         <w:rPr>
@@ -272,10 +327,10 @@
           <w:lang w:val="en-US"/>
         </w:rPr>
         <w:drawing>
-          <wp:inline distT="0" distB="0" distL="0" distR="0" wp14:anchorId="482AD633" wp14:editId="6183EB54">
+          <wp:inline distT="0" distB="0" distL="0" distR="0" wp14:anchorId="48CF701C" wp14:editId="6126E35F">
             <wp:extent cx="5943600" cy="2533650"/>
             <wp:effectExtent l="0" t="0" r="0" b="0"/>
-            <wp:docPr id="1844124509" name="Picture 3"/>
+            <wp:docPr id="527267623" name="Picture 3"/>
             <wp:cNvGraphicFramePr>
               <a:graphicFrameLocks xmlns:a="http://schemas.openxmlformats.org/drawingml/2006/main" noChangeAspect="1"/>
             </wp:cNvGraphicFramePr>
@@ -283,7 +338,7 @@
               <a:graphicData uri="http://schemas.openxmlformats.org/drawingml/2006/picture">
                 <pic:pic xmlns:pic="http://schemas.openxmlformats.org/drawingml/2006/picture">
                   <pic:nvPicPr>
-                    <pic:cNvPr id="1844124509" name="Picture 1844124509"/>
+                    <pic:cNvPr id="527267623" name="Picture 527267623"/>
                     <pic:cNvPicPr/>
                   </pic:nvPicPr>
                   <pic:blipFill>

</xml_diff>